<commit_message>
Direct send + bulk day editor + planner economics + validated checks (ported)
</commit_message>
<xml_diff>
--- a/docs/Work_Management_Manual.docx
+++ b/docs/Work_Management_Manual.docx
@@ -209,7 +209,7 @@
     </w:p>
     <w:p>
       <w:r>
-        <w:t>The payment section is worker-centric. Each worker's confirmed earnings are reviewed, sent to accounts as their own payment entry, and released. The status ladder per worker is: Unpaid → Reviewed → Sent to accounts → Paid.</w:t>
+        <w:t>The payment section is worker-centric. Each worker's confirmed earnings are sent to accounts as their own payment entry and released. The status ladder per worker is: Unpaid → Sent to accounts → Paid. There is no separate review step — sending IS the sign-off: the sender's name and time are stamped on every included day-row and on the payment entry. The review sheet stays available for checking anyone before sending.</w:t>
       </w:r>
     </w:p>
     <w:p>
@@ -244,7 +244,7 @@
         <w:pStyle w:val="ListBullet"/>
       </w:pPr>
       <w:r>
-        <w:t>Every day row shows presence evidence next to the pay. Unpaid days can be corrected with Edit — pay recomputes at the row's rate, the parent re-sums, an audit comment records the change, and the worker returns to Unpaid for re-review.</w:t>
+        <w:t>Every day row shows presence evidence next to the pay. In Work &amp; days, every unpaid day's quantity is directly editable — change as many as needed and press the single Save changes button at the bottom (Undo restores the originals). Pay recomputes at each row's rate, documents re-sum, and one audit comment per document lists every change.</w:t>
       </w:r>
     </w:p>
     <w:p>
@@ -271,7 +271,7 @@
         <w:pStyle w:val="ListBullet"/>
       </w:pPr>
       <w:r>
-        <w:t>Review &amp; approve stamps the worker's unpaid rows as Reviewed (who + when — the stamps live on the day rows and travel onto the payment entry).</w:t>
+        <w:t>Submit &amp; send to accounts creates one payment document for that worker (WMPAY-…) holding the period, totals, who sent it and when, and one line per actuals document with the task, block, worked period, days, qty, rate, amount and the whole sign-off chain. The sender is stamped as reviewer on every included day-row.</w:t>
       </w:r>
     </w:p>
     <w:p>
@@ -279,15 +279,7 @@
         <w:pStyle w:val="ListBullet"/>
       </w:pPr>
       <w:r>
-        <w:t>Send to accounts creates one payment document for that worker (WMPAY-…) holding the period, totals, reviewer, and one line per actuals document with the task, block, worked period, days, qty, rate, amount and the whole sign-off chain.</w:t>
-      </w:r>
-    </w:p>
-    <w:p>
-      <w:pPr>
-        <w:pStyle w:val="ListBullet"/>
-      </w:pPr>
-      <w:r>
-        <w:t>Bulk: tick several workers (workers with attendance conflicts carry a red flag with the day count) and use Review &amp; send to accounts — each still gets their own entry.</w:t>
+        <w:t>Bulk: tick several workers (workers with attendance conflicts carry a red flag with the day count) and use Send to accounts — each still gets their own entry.</w:t>
       </w:r>
     </w:p>
     <w:p>
@@ -386,7 +378,7 @@
         <w:pStyle w:val="ListBullet"/>
       </w:pPr>
       <w:r>
-        <w:t>Paid on marked-Absent days — a scan time means the attendance record is probably wrong; no scan means the entry needs scrutiny.</w:t>
+        <w:t>Paid on marked-Absent days — a scan time means the attendance record is probably wrong; no scan means the entry needs scrutiny. Days whose attendance was corrected (a Present record exists alongside an old Absent one) are validated out and never flagged.</w:t>
       </w:r>
     </w:p>
     <w:p>
@@ -541,7 +533,7 @@
         <w:pStyle w:val="ListBullet"/>
       </w:pPr>
       <w:r>
-        <w:t>Pipeline performers — every plan creator, assigner, actuals enterer and approver ranked by volume and value.</w:t>
+        <w:t>Pipeline performers — planner and assigner economics, per person: plans created, target vs actual quantity (achievement %), planned budget vs money spent, and cost per unit, with most/least-expensive callouts (judged only on people with real volume). The Assigners tab shows assignments made, workers put on jobs, output and spend on their assignments.</w:t>
       </w:r>
     </w:p>
     <w:p>

</xml_diff>

<commit_message>
Remove Operations control section (ported)
</commit_message>
<xml_diff>
--- a/docs/Work_Management_Manual.docx
+++ b/docs/Work_Management_Manual.docx
@@ -517,14 +517,6 @@
         <w:pStyle w:val="ListBullet"/>
       </w:pPr>
       <w:r>
-        <w:t>Approver KPIs — per approval stage: each approver's sign-offs, value and time taken.</w:t>
-      </w:r>
-    </w:p>
-    <w:p>
-      <w:pPr>
-        <w:pStyle w:val="ListBullet"/>
-      </w:pPr>
-      <w:r>
         <w:t>Value flow — weekly planned/assigned/confirmed value and a per-plan table with each plan's accountability chain.</w:t>
       </w:r>
     </w:p>

</xml_diff>

<commit_message>
Consultant weekly review: gate, week board API, planner tab, doctype fields
- api/planner.py: consultant gate in approve; week_board/week_approve/week_return
- www/work-planner.html/.js: Weekly review tab and board
- Work Management Settings: require_consultant_approval, consultant_users
- Work Management Planner: custom_consultant_state/by/at/note
- docs: manual updated
</commit_message>
<xml_diff>
--- a/docs/Work_Management_Manual.docx
+++ b/docs/Work_Management_Manual.docx
@@ -92,6 +92,67 @@
       </w:pPr>
       <w:r>
         <w:t>Approved plans become available to the Assigner. A plan's budget = rate × target quantity.</w:t>
+      </w:r>
+    </w:p>
+    <w:p>
+      <w:pPr>
+        <w:pStyle w:val="Heading2"/>
+      </w:pPr>
+      <w:r>
+        <w:rPr>
+          <w:color w:val="0A0A0A"/>
+        </w:rPr>
+        <w:t>Consultant weekly review (Weekly review tab)</w:t>
+      </w:r>
+    </w:p>
+    <w:p>
+      <w:r>
+        <w:t>Plans that start in an upcoming week must be signed off by a consultant before the Farm Manager can approve them individually. Plans for the current week are exempt, so day-to-day operations are never blocked.</w:t>
+      </w:r>
+    </w:p>
+    <w:p>
+      <w:pPr>
+        <w:pStyle w:val="ListNumber"/>
+      </w:pPr>
+      <w:r>
+        <w:t>Open the Weekly review tab on /work-planner, pick the farm and the week (it defaults to next Monday; use Prev/Next week to move).</w:t>
+      </w:r>
+    </w:p>
+    <w:p>
+      <w:pPr>
+        <w:pStyle w:val="ListNumber"/>
+      </w:pPr>
+      <w:r>
+        <w:t>The board shows the whole week as one package: number of plans, total budgeted value (rate × target across every plan), peak crew per day against the farm's active workforce, and a day-by-day crew-load chart. If any day asks for more workers than the farm has, the board flags the week as over-planned.</w:t>
+      </w:r>
+    </w:p>
+    <w:p>
+      <w:pPr>
+        <w:pStyle w:val="ListNumber"/>
+      </w:pPr>
+      <w:r>
+        <w:t>Below the chart, every plan is listed with its task, blocks, period, crew per day, target, rate, budget, who requested it, and its consultant status.</w:t>
+      </w:r>
+    </w:p>
+    <w:p>
+      <w:pPr>
+        <w:pStyle w:val="ListNumber"/>
+      </w:pPr>
+      <w:r>
+        <w:t>Consultants decide the week in one action: 'Approve week' stamps every plan as consultant-approved and unlocks Farm Manager approval; 'Return with note' sends the whole week back — the note is required and is written on every plan for the planner to act on.</w:t>
+      </w:r>
+    </w:p>
+    <w:p>
+      <w:pPr>
+        <w:pStyle w:val="ListNumber"/>
+      </w:pPr>
+      <w:r>
+        <w:t>Every decision is stamped on the plans (who, when, note) and logged as a comment, so the trail survives on the document.</w:t>
+      </w:r>
+    </w:p>
+    <w:p>
+      <w:r>
+        <w:t>Who can decide: only the users named in Work Management Settings → Consultant users (comma-separated emails), plus System Managers. Everyone else sees the board read-only. The whole gate can be switched off with the 'Require consultant approval for future-week plans' checkbox in Settings.</w:t>
       </w:r>
     </w:p>
     <w:p>
@@ -684,6 +745,14 @@
     </w:p>
     <w:p>
       <w:pPr>
+        <w:pStyle w:val="ListBullet"/>
+      </w:pPr>
+      <w:r>
+        <w:t>Consultant weekly review: require consultant approval for future-week plans (on by default), consultant users — the comma-separated emails allowed to approve or return a farm's week.</w:t>
+      </w:r>
+    </w:p>
+    <w:p>
+      <w:pPr>
         <w:pStyle w:val="Heading1"/>
       </w:pPr>
       <w:r>

</xml_diff>

<commit_message>
Manual: attendance mechanics detailed in the Assigner section
</commit_message>
<xml_diff>
--- a/docs/Work_Management_Manual.docx
+++ b/docs/Work_Management_Manual.docx
@@ -204,6 +204,78 @@
       </w:pPr>
       <w:r>
         <w:t>The General Manager signs off assignments. Mid-job changes use the swap button — substitutions record who left, who joined and when.</w:t>
+      </w:r>
+    </w:p>
+    <w:p>
+      <w:pPr>
+        <w:pStyle w:val="Heading2"/>
+      </w:pPr>
+      <w:r>
+        <w:rPr>
+          <w:color w:val="0A0A0A"/>
+        </w:rPr>
+        <w:t>How attendance is checked at assignment</w:t>
+      </w:r>
+    </w:p>
+    <w:p>
+      <w:r>
+        <w:t>Every worker is screened against attendance before they can be given work. Each check is a switch in Work Management Settings (section 10).</w:t>
+      </w:r>
+    </w:p>
+    <w:p>
+      <w:pPr>
+        <w:pStyle w:val="ListBullet"/>
+      </w:pPr>
+      <w:r>
+        <w:t>Marked Absent — a submitted Absent attendance record blocks the worker for that day. A Present, Half Day or WFH record on the same day always wins over a stale Absent one, so corrected attendance clears the flag immediately.</w:t>
+      </w:r>
+    </w:p>
+    <w:p>
+      <w:pPr>
+        <w:pStyle w:val="ListBullet"/>
+      </w:pPr>
+      <w:r>
+        <w:t>Approved leave — leave overlapping the work window flags the worker.</w:t>
+      </w:r>
+    </w:p>
+    <w:p>
+      <w:pPr>
+        <w:pStyle w:val="ListBullet"/>
+      </w:pPr>
+      <w:r>
+        <w:t>Weekly offs and holidays — the off-day rule is configurable: flag only when offs cover the whole window (default), flag any off day in the window, or ignore offs at assignment. Night-shift guards whose off starts the morning after their shift are handled by the same rule.</w:t>
+      </w:r>
+    </w:p>
+    <w:p>
+      <w:pPr>
+        <w:pStyle w:val="ListBullet"/>
+      </w:pPr>
+      <w:r>
+        <w:t>Morning presence — when the window includes today, the worker must have scanned in (or have a Present record) by the cutoff time (default 09:00). Before the cutoff nobody is blocked, so early assigning always works; night shifts are exempt.</w:t>
+      </w:r>
+    </w:p>
+    <w:p>
+      <w:pPr>
+        <w:pStyle w:val="ListBullet"/>
+      </w:pPr>
+      <w:r>
+        <w:t>Assigned elsewhere — a worker already on a live assignment for an overlapping period cannot be picked at all; this one has no override because it creates double pay.</w:t>
+      </w:r>
+    </w:p>
+    <w:p>
+      <w:pPr>
+        <w:pStyle w:val="ListBullet"/>
+      </w:pPr>
+      <w:r>
+        <w:t>Overrides — leave, off-day and no-scan conflicts can be pushed through with an explicit confirmation; the server re-checks on submit and writes every override on the assignment, so the trail is permanent. Recording actuals on a marked-Absent day is stricter: only the Farm Manager or GM can confirm it.</w:t>
+      </w:r>
+    </w:p>
+    <w:p>
+      <w:pPr>
+        <w:pStyle w:val="ListBullet"/>
+      </w:pPr>
+      <w:r>
+        <w:t>Missing attendance never blocks anyone — only an explicit record does, so a device sync gap cannot stop work from being assigned.</w:t>
       </w:r>
     </w:p>
     <w:p>

</xml_diff>

<commit_message>
Assigner: today's presence chip (P / A / ?) on every worker, any window
</commit_message>
<xml_diff>
--- a/docs/Work_Management_Manual.docx
+++ b/docs/Work_Management_Manual.docx
@@ -179,7 +179,7 @@
         <w:pStyle w:val="ListNumber"/>
       </w:pPr>
       <w:r>
-        <w:t>Every worker carries live badges: presence (P · 06:12 scanned in, 'not in yet', or 'night shift'), off days in the window, leave, absences, and 'assigned elsewhere' (a worker on another live assignment for an overlapping period cannot be picked — this prevents double allocation and double pay).</w:t>
+        <w:t>Every worker carries today's presence chip, whatever the work window: P · 06:12 (scanned in or marked Present), A today (submitted Absent record — a Present record always beats a stale Absent one), ? today (no scan or attendance record yet), or 'night shift'. Alongside it: off days in the window, leave, absences, and 'assigned elsewhere' (a worker on another live assignment for an overlapping period cannot be picked — this prevents double allocation and double pay).</w:t>
       </w:r>
     </w:p>
     <w:p>
@@ -187,7 +187,7 @@
         <w:pStyle w:val="ListNumber"/>
       </w:pPr>
       <w:r>
-        <w:t>When the window includes today, a presence bar shows how many of the farm's workers have scanned in, with a 'only workers who are in' filter and a Refresh scans link.</w:t>
+        <w:t>A presence bar above the picker shows how many of the farm's workers are in today, a key for the chips, an 'only workers who are in' filter and a Refresh scans link. The morning-scan block itself still applies only to day-of assignment.</w:t>
       </w:r>
     </w:p>
     <w:p>

</xml_diff>

<commit_message>
Document the taxonomy template and sections in the user guide
</commit_message>
<xml_diff>
--- a/docs/Work_Management_Manual.docx
+++ b/docs/Work_Management_Manual.docx
@@ -1603,7 +1603,96 @@
         <w:rPr>
           <w:color w:val="A06000"/>
         </w:rPr>
-        <w:t>13. Approval stages and approvers</w:t>
+        <w:t>13. Naming the levels</w:t>
+      </w:r>
+    </w:p>
+    <w:p>
+      <w:r>
+        <w:t>The module ships calling things farms and blocks. If your project calls them estates and plots, say so once in Work Management Settings under Taxonomy and every form, screen and column heading follows. Nothing about the data changes — only what it is called.</w:t>
+      </w:r>
+    </w:p>
+    <w:p>
+      <w:pPr>
+        <w:pStyle w:val="ListBullet"/>
+      </w:pPr>
+      <w:r>
+        <w:t>Leave a name empty to use the built-in wording.</w:t>
+      </w:r>
+    </w:p>
+    <w:p>
+      <w:pPr>
+        <w:pStyle w:val="ListBullet"/>
+      </w:pPr>
+      <w:r>
+        <w:t>Turn on the level above the farm if your farms belong to a business unit; reports can then group by it.</w:t>
+      </w:r>
+    </w:p>
+    <w:p>
+      <w:pPr>
+        <w:pStyle w:val="ListBullet"/>
+      </w:pPr>
+      <w:r>
+        <w:t>The cost grouping name is used by the section view described below.</w:t>
+      </w:r>
+    </w:p>
+    <w:p>
+      <w:pPr>
+        <w:pStyle w:val="Heading2"/>
+      </w:pPr>
+      <w:r>
+        <w:rPr>
+          <w:color w:val="A06000"/>
+        </w:rPr>
+        <w:t>14. Sections, and cost by section</w:t>
+      </w:r>
+    </w:p>
+    <w:p>
+      <w:r>
+        <w:t>A section is a group of blocks. It exists so the cost-centre view on the dashboard can be read by section instead of block by block — nothing else in the system uses it, and no plan, assignment or payment mentions one.</w:t>
+      </w:r>
+    </w:p>
+    <w:p>
+      <w:pPr>
+        <w:pStyle w:val="ListNumber"/>
+      </w:pPr>
+      <w:r>
+        <w:t>Create a section, give it a farm, and add its blocks to the table.</w:t>
+      </w:r>
+    </w:p>
+    <w:p>
+      <w:pPr>
+        <w:pStyle w:val="ListNumber"/>
+      </w:pPr>
+      <w:r>
+        <w:t>A block belongs to one section only. Adding a block another section already holds is refused, naming that section — counted twice it would double its cost in the total.</w:t>
+      </w:r>
+    </w:p>
+    <w:p>
+      <w:pPr>
+        <w:pStyle w:val="ListNumber"/>
+      </w:pPr>
+      <w:r>
+        <w:t>On the dashboard, the cost-centre view has a Group toggle: by block, or by section. Overheads and administration appear under both.</w:t>
+      </w:r>
+    </w:p>
+    <w:p>
+      <w:r>
+        <w:rPr>
+          <w:color w:val="A06000"/>
+          <w:sz w:val="19"/>
+        </w:rPr>
+        <w:t>Note — Blocks you have not placed in a section are grouped under Unassigned, never dropped, so the section view always totals the same as the block view.</w:t>
+      </w:r>
+    </w:p>
+    <w:p>
+      <w:pPr>
+        <w:pStyle w:val="Heading2"/>
+      </w:pPr>
+      <w:r>
+        <w:rPr>
+          <w:color w:val="A06000"/>
+        </w:rPr>
+        <w:t>15. Approval stages and approvers</w:t>
       </w:r>
     </w:p>
     <w:p>
@@ -1619,7 +1708,7 @@
         <w:rPr>
           <w:color w:val="0A0A0A"/>
         </w:rPr>
-        <w:t>13.1 The two tables</w:t>
+        <w:t>15.1 The two tables</w:t>
       </w:r>
     </w:p>
     <w:p>
@@ -1651,7 +1740,7 @@
         <w:rPr>
           <w:color w:val="0A0A0A"/>
         </w:rPr>
-        <w:t>13.2 Switching a step off</w:t>
+        <w:t>15.2 Switching a step off</w:t>
       </w:r>
     </w:p>
     <w:p>
@@ -1667,7 +1756,7 @@
         <w:rPr>
           <w:color w:val="0A0A0A"/>
         </w:rPr>
-        <w:t>13.3 Approvers for one farm only</w:t>
+        <w:t>15.3 Approvers for one farm only</w:t>
       </w:r>
     </w:p>
     <w:p>
@@ -1697,7 +1786,7 @@
         <w:rPr>
           <w:color w:val="0A0A0A"/>
         </w:rPr>
-        <w:t>13.4 What changes when you save</w:t>
+        <w:t>15.4 What changes when you save</w:t>
       </w:r>
     </w:p>
     <w:p>
@@ -1732,7 +1821,7 @@
         <w:rPr>
           <w:color w:val="0A0A0A"/>
         </w:rPr>
-        <w:t>13.5 The stages</w:t>
+        <w:t>15.5 The stages</w:t>
       </w:r>
     </w:p>
     <w:p>
@@ -2765,7 +2854,7 @@
         <w:rPr>
           <w:color w:val="A06000"/>
         </w:rPr>
-        <w:t>14. Settings reference</w:t>
+        <w:t>16. Settings reference</w:t>
       </w:r>
     </w:p>
     <w:p>
@@ -3101,6 +3190,348 @@
           <w:color w:val="6F6D65"/>
           <w:sz w:val="17"/>
         </w:rPr>
+        <w:t>Taxonomy</w:t>
+      </w:r>
+    </w:p>
+    <w:tbl>
+      <w:tblPr>
+        <w:tblStyle w:val="LightGrid-Accent1"/>
+        <w:tblW w:type="auto" w:w="0"/>
+        <w:tblLook w:firstColumn="1" w:firstRow="1" w:lastColumn="0" w:lastRow="0" w:noHBand="0" w:noVBand="1" w:val="04A0"/>
+      </w:tblPr>
+      <w:tblGrid>
+        <w:gridCol w:w="2880"/>
+        <w:gridCol w:w="2880"/>
+        <w:gridCol w:w="2880"/>
+      </w:tblGrid>
+      <w:tr>
+        <w:tc>
+          <w:tcPr>
+            <w:tcW w:type="dxa" w:w="2880"/>
+          </w:tcPr>
+          <w:p>
+            <w:r>
+              <w:t>Setting</w:t>
+            </w:r>
+          </w:p>
+        </w:tc>
+        <w:tc>
+          <w:tcPr>
+            <w:tcW w:type="dxa" w:w="2880"/>
+          </w:tcPr>
+          <w:p>
+            <w:r>
+              <w:t>Type</w:t>
+            </w:r>
+          </w:p>
+        </w:tc>
+        <w:tc>
+          <w:tcPr>
+            <w:tcW w:type="dxa" w:w="2880"/>
+          </w:tcPr>
+          <w:p>
+            <w:r>
+              <w:t>What it does</w:t>
+            </w:r>
+          </w:p>
+        </w:tc>
+      </w:tr>
+      <w:tr>
+        <w:tc>
+          <w:tcPr>
+            <w:tcW w:type="dxa" w:w="2880"/>
+          </w:tcPr>
+          <w:p>
+            <w:r>
+              <w:t>Use a level above the farm</w:t>
+            </w:r>
+          </w:p>
+        </w:tc>
+        <w:tc>
+          <w:tcPr>
+            <w:tcW w:type="dxa" w:w="2880"/>
+          </w:tcPr>
+          <w:p>
+            <w:r>
+              <w:t>Check</w:t>
+            </w:r>
+          </w:p>
+        </w:tc>
+        <w:tc>
+          <w:tcPr>
+            <w:tcW w:type="dxa" w:w="2880"/>
+          </w:tcPr>
+          <w:p>
+            <w:r>
+              <w:t>On: farms belong to a business unit, and reports can group by it.</w:t>
+            </w:r>
+          </w:p>
+        </w:tc>
+      </w:tr>
+      <w:tr>
+        <w:tc>
+          <w:tcPr>
+            <w:tcW w:type="dxa" w:w="2880"/>
+          </w:tcPr>
+          <w:p>
+            <w:r>
+              <w:t>Level above the farm (singular)</w:t>
+            </w:r>
+          </w:p>
+        </w:tc>
+        <w:tc>
+          <w:tcPr>
+            <w:tcW w:type="dxa" w:w="2880"/>
+          </w:tcPr>
+          <w:p>
+            <w:r>
+              <w:t>Data</w:t>
+            </w:r>
+          </w:p>
+        </w:tc>
+        <w:tc>
+          <w:tcPr>
+            <w:tcW w:type="dxa" w:w="2880"/>
+          </w:tcPr>
+          <w:p>
+            <w:r>
+              <w:t>Default: Business Unit.</w:t>
+            </w:r>
+          </w:p>
+        </w:tc>
+      </w:tr>
+      <w:tr>
+        <w:tc>
+          <w:tcPr>
+            <w:tcW w:type="dxa" w:w="2880"/>
+          </w:tcPr>
+          <w:p>
+            <w:r>
+              <w:t>Level above the farm (plural)</w:t>
+            </w:r>
+          </w:p>
+        </w:tc>
+        <w:tc>
+          <w:tcPr>
+            <w:tcW w:type="dxa" w:w="2880"/>
+          </w:tcPr>
+          <w:p>
+            <w:r>
+              <w:t>Data</w:t>
+            </w:r>
+          </w:p>
+        </w:tc>
+        <w:tc>
+          <w:tcPr>
+            <w:tcW w:type="dxa" w:w="2880"/>
+          </w:tcPr>
+          <w:p>
+            <w:r>
+              <w:t>Default: Business Units.</w:t>
+            </w:r>
+          </w:p>
+        </w:tc>
+      </w:tr>
+      <w:tr>
+        <w:tc>
+          <w:tcPr>
+            <w:tcW w:type="dxa" w:w="2880"/>
+          </w:tcPr>
+          <w:p>
+            <w:r>
+              <w:t>Farm level (singular)</w:t>
+            </w:r>
+          </w:p>
+        </w:tc>
+        <w:tc>
+          <w:tcPr>
+            <w:tcW w:type="dxa" w:w="2880"/>
+          </w:tcPr>
+          <w:p>
+            <w:r>
+              <w:t>Data</w:t>
+            </w:r>
+          </w:p>
+        </w:tc>
+        <w:tc>
+          <w:tcPr>
+            <w:tcW w:type="dxa" w:w="2880"/>
+          </w:tcPr>
+          <w:p>
+            <w:r>
+              <w:t>Default: Farm. Estate, site, division — whatever your project calls it.</w:t>
+            </w:r>
+          </w:p>
+        </w:tc>
+      </w:tr>
+      <w:tr>
+        <w:tc>
+          <w:tcPr>
+            <w:tcW w:type="dxa" w:w="2880"/>
+          </w:tcPr>
+          <w:p>
+            <w:r>
+              <w:t>Farm level (plural)</w:t>
+            </w:r>
+          </w:p>
+        </w:tc>
+        <w:tc>
+          <w:tcPr>
+            <w:tcW w:type="dxa" w:w="2880"/>
+          </w:tcPr>
+          <w:p>
+            <w:r>
+              <w:t>Data</w:t>
+            </w:r>
+          </w:p>
+        </w:tc>
+        <w:tc>
+          <w:tcPr>
+            <w:tcW w:type="dxa" w:w="2880"/>
+          </w:tcPr>
+          <w:p>
+            <w:r>
+              <w:t>Default: Farms.</w:t>
+            </w:r>
+          </w:p>
+        </w:tc>
+      </w:tr>
+      <w:tr>
+        <w:tc>
+          <w:tcPr>
+            <w:tcW w:type="dxa" w:w="2880"/>
+          </w:tcPr>
+          <w:p>
+            <w:r>
+              <w:t>Block level (singular)</w:t>
+            </w:r>
+          </w:p>
+        </w:tc>
+        <w:tc>
+          <w:tcPr>
+            <w:tcW w:type="dxa" w:w="2880"/>
+          </w:tcPr>
+          <w:p>
+            <w:r>
+              <w:t>Data</w:t>
+            </w:r>
+          </w:p>
+        </w:tc>
+        <w:tc>
+          <w:tcPr>
+            <w:tcW w:type="dxa" w:w="2880"/>
+          </w:tcPr>
+          <w:p>
+            <w:r>
+              <w:t>Default: Block. The piece of ground work is planned against.</w:t>
+            </w:r>
+          </w:p>
+        </w:tc>
+      </w:tr>
+      <w:tr>
+        <w:tc>
+          <w:tcPr>
+            <w:tcW w:type="dxa" w:w="2880"/>
+          </w:tcPr>
+          <w:p>
+            <w:r>
+              <w:t>Block level (plural)</w:t>
+            </w:r>
+          </w:p>
+        </w:tc>
+        <w:tc>
+          <w:tcPr>
+            <w:tcW w:type="dxa" w:w="2880"/>
+          </w:tcPr>
+          <w:p>
+            <w:r>
+              <w:t>Data</w:t>
+            </w:r>
+          </w:p>
+        </w:tc>
+        <w:tc>
+          <w:tcPr>
+            <w:tcW w:type="dxa" w:w="2880"/>
+          </w:tcPr>
+          <w:p>
+            <w:r>
+              <w:t>Default: Blocks.</w:t>
+            </w:r>
+          </w:p>
+        </w:tc>
+      </w:tr>
+      <w:tr>
+        <w:tc>
+          <w:tcPr>
+            <w:tcW w:type="dxa" w:w="2880"/>
+          </w:tcPr>
+          <w:p>
+            <w:r>
+              <w:t>Cost grouping (singular)</w:t>
+            </w:r>
+          </w:p>
+        </w:tc>
+        <w:tc>
+          <w:tcPr>
+            <w:tcW w:type="dxa" w:w="2880"/>
+          </w:tcPr>
+          <w:p>
+            <w:r>
+              <w:t>Data</w:t>
+            </w:r>
+          </w:p>
+        </w:tc>
+        <w:tc>
+          <w:tcPr>
+            <w:tcW w:type="dxa" w:w="2880"/>
+          </w:tcPr>
+          <w:p>
+            <w:r>
+              <w:t>Default: Section. Names the grouping the cost-centre view can be switched to, and the toggle that switches it.</w:t>
+            </w:r>
+          </w:p>
+        </w:tc>
+      </w:tr>
+      <w:tr>
+        <w:tc>
+          <w:tcPr>
+            <w:tcW w:type="dxa" w:w="2880"/>
+          </w:tcPr>
+          <w:p>
+            <w:r>
+              <w:t>Cost grouping (plural)</w:t>
+            </w:r>
+          </w:p>
+        </w:tc>
+        <w:tc>
+          <w:tcPr>
+            <w:tcW w:type="dxa" w:w="2880"/>
+          </w:tcPr>
+          <w:p>
+            <w:r>
+              <w:t>Data</w:t>
+            </w:r>
+          </w:p>
+        </w:tc>
+        <w:tc>
+          <w:tcPr>
+            <w:tcW w:type="dxa" w:w="2880"/>
+          </w:tcPr>
+          <w:p>
+            <w:r>
+              <w:t>Default: Sections.</w:t>
+            </w:r>
+          </w:p>
+        </w:tc>
+      </w:tr>
+    </w:tbl>
+    <w:p/>
+    <w:p>
+      <w:r>
+        <w:rPr>
+          <w:color w:val="6F6D65"/>
+          <w:sz w:val="17"/>
+        </w:rPr>
         <w:t>Time &amp; Attendance integration</w:t>
       </w:r>
     </w:p>
@@ -3592,7 +4023,7 @@
           </w:tcPr>
           <w:p>
             <w:r>
-              <w:t>Two farms, one day</w:t>
+              <w:t>Two Farms, one day</w:t>
             </w:r>
           </w:p>
         </w:tc>
@@ -4741,7 +5172,7 @@
         <w:rPr>
           <w:color w:val="A06000"/>
         </w:rPr>
-        <w:t>15. Definitions</w:t>
+        <w:t>17. Definitions</w:t>
       </w:r>
     </w:p>
     <w:p>

</xml_diff>

<commit_message>
Write down that a request records its budget
The developer guide gains the rule and the reason: a farm may hold two
plans over one period only because the request now carries the link, and
those are the same fact rather than two changes. Records the three-way
resolution, that the mirror inlines it, that every attributing read
prefers the link and falls back to containment only where it is null --
not both, or a linked request counts twice -- and which scripts attribute
nothing to a plan, so nobody re-audits them from scratch.

Also the invariant that caught the last bugs: every query using
%(plan)s is passed it. The same query appears at four indentations in
wm_dashboard, and pattern replacement matched one and missed three.

Co-Authored-By: Claude Opus 5 (1M context) <noreply@anthropic.com>
</commit_message>
<xml_diff>
--- a/docs/Work_Management_Manual.docx
+++ b/docs/Work_Management_Manual.docx
@@ -3127,6 +3127,38 @@
           </w:tcPr>
           <w:p>
             <w:r>
+              <w:t>Farms in use</w:t>
+            </w:r>
+          </w:p>
+        </w:tc>
+        <w:tc>
+          <w:tcPr>
+            <w:tcW w:type="dxa" w:w="2880"/>
+          </w:tcPr>
+          <w:p>
+            <w:r>
+              <w:t>Table MultiSelect</w:t>
+            </w:r>
+          </w:p>
+        </w:tc>
+        <w:tc>
+          <w:tcPr>
+            <w:tcW w:type="dxa" w:w="2880"/>
+          </w:tcPr>
+          <w:p>
+            <w:r>
+              <w:t>The farms this project plans work against. Leave it empty and every farm in Upande Core is offered — narrow it here and the planner, assigner, actuals, payment and master plan screens offer only these. It changes what this app shows; the farms themselves, and every other Upande app, are untouched.</w:t>
+            </w:r>
+          </w:p>
+        </w:tc>
+      </w:tr>
+      <w:tr>
+        <w:tc>
+          <w:tcPr>
+            <w:tcW w:type="dxa" w:w="2880"/>
+          </w:tcPr>
+          <w:p>
+            <w:r>
               <w:t>Farms</w:t>
             </w:r>
           </w:p>

</xml_diff>

<commit_message>
Rebuild the manual, which has been a commit behind its source
3bd84d6 told the docs where farms live now but left the two built artefacts at
78ceb13, so the shipped PDF and docx have been describing the old arrangement
ever since. Regenerated from the committed manual_content.py -- 28 KB of text
the built copies were missing.

No content change of my own: build_manual.py run twice produces byte-identical
page streams, so this is purely the catch-up.
</commit_message>
<xml_diff>
--- a/docs/Work_Management_Manual.docx
+++ b/docs/Work_Management_Manual.docx
@@ -2319,68 +2319,6 @@
           </w:tcPr>
           <w:p>
             <w:r>
-              <w:t>Planner: Weekly Consultant</w:t>
-            </w:r>
-          </w:p>
-        </w:tc>
-        <w:tc>
-          <w:tcPr>
-            <w:tcW w:type="dxa" w:w="1440"/>
-          </w:tcPr>
-          <w:p>
-            <w:r>
-              <w:t>Planner</w:t>
-            </w:r>
-          </w:p>
-        </w:tc>
-        <w:tc>
-          <w:tcPr>
-            <w:tcW w:type="dxa" w:w="1440"/>
-          </w:tcPr>
-          <w:p>
-            <w:r>
-              <w:t>Gate</w:t>
-            </w:r>
-          </w:p>
-        </w:tc>
-        <w:tc>
-          <w:tcPr>
-            <w:tcW w:type="dxa" w:w="1440"/>
-          </w:tcPr>
-          <w:p>
-            <w:r>
-              <w:t>—</w:t>
-            </w:r>
-          </w:p>
-        </w:tc>
-        <w:tc>
-          <w:tcPr>
-            <w:tcW w:type="dxa" w:w="1440"/>
-          </w:tcPr>
-          <w:p>
-            <w:r>
-              <w:t>—</w:t>
-            </w:r>
-          </w:p>
-        </w:tc>
-        <w:tc>
-          <w:tcPr>
-            <w:tcW w:type="dxa" w:w="1440"/>
-          </w:tcPr>
-          <w:p>
-            <w:r>
-              <w:t>—</w:t>
-            </w:r>
-          </w:p>
-        </w:tc>
-      </w:tr>
-      <w:tr>
-        <w:tc>
-          <w:tcPr>
-            <w:tcW w:type="dxa" w:w="1440"/>
-          </w:tcPr>
-          <w:p>
-            <w:r>
               <w:t>Assigner: Submit</w:t>
             </w:r>
           </w:p>
@@ -2956,7 +2894,7 @@
           <w:color w:val="6F6D65"/>
           <w:sz w:val="17"/>
         </w:rPr>
-        <w:t>General</w:t>
+        <w:t>Defaults</w:t>
       </w:r>
     </w:p>
     <w:tbl>
@@ -3127,7 +3065,7 @@
           </w:tcPr>
           <w:p>
             <w:r>
-              <w:t>Farms in use</w:t>
+              <w:t>Only work the Farms listed below</w:t>
             </w:r>
           </w:p>
         </w:tc>
@@ -3137,7 +3075,7 @@
           </w:tcPr>
           <w:p>
             <w:r>
-              <w:t>Table MultiSelect</w:t>
+              <w:t>Check</w:t>
             </w:r>
           </w:p>
         </w:tc>
@@ -3147,7 +3085,7 @@
           </w:tcPr>
           <w:p>
             <w:r>
-              <w:t>The farms this project plans work against. Leave it empty and every farm in Upande Core is offered — narrow it here and the planner, assigner, actuals, payment and master plan screens offer only these. It changes what this app shows; the farms themselves, and every other Upande app, are untouched.</w:t>
+              <w:t>Off: every farm in Upande Core is available, and the table below only supplies cost projects and area overrides. On: the screens offer just the farms listed. Off by default, so adding a row to give a farm its cost project never hides the others.</w:t>
             </w:r>
           </w:p>
         </w:tc>
@@ -3159,7 +3097,7 @@
           </w:tcPr>
           <w:p>
             <w:r>
-              <w:t>Farms</w:t>
+              <w:t>Only show each person the Farms they are permitted</w:t>
             </w:r>
           </w:p>
         </w:tc>
@@ -3169,6 +3107,47 @@
           </w:tcPr>
           <w:p>
             <w:r>
+              <w:t>Check</w:t>
+            </w:r>
+          </w:p>
+        </w:tc>
+        <w:tc>
+          <w:tcPr>
+            <w:tcW w:type="dxa" w:w="2880"/>
+          </w:tcPr>
+          <w:p>
+            <w:r>
+              <w:t>On: the farm list every screen offers is narrowed to the farms this person holds a Frappe User Permission for, and a person with no such permission still sees every farm -- Frappe's own default. Off, the default, is exactly today's behaviour on every site.</w:t>
+              <w:br/>
+              <w:br/>
+              <w:t>Run the audit before turning this on. It reports who would lose access and who has already been working farms they are not permitted:</w:t>
+              <w:br/>
+              <w:br/>
+              <w:t xml:space="preserve">    bench --site &amp;lt;site&amp;gt; execute work_management.farm_permission_audit.print_report</w:t>
+              <w:br/>
+              <w:br/>
+              <w:t>Anybody it lists as working outside their permission is either mis-permissioned or the permission is wrong, and that has to be settled by a person before this is switched on -- otherwise the fix looks like an outage.</w:t>
+            </w:r>
+          </w:p>
+        </w:tc>
+      </w:tr>
+      <w:tr>
+        <w:tc>
+          <w:tcPr>
+            <w:tcW w:type="dxa" w:w="2880"/>
+          </w:tcPr>
+          <w:p>
+            <w:r>
+              <w:t>Farms in use</w:t>
+            </w:r>
+          </w:p>
+        </w:tc>
+        <w:tc>
+          <w:tcPr>
+            <w:tcW w:type="dxa" w:w="2880"/>
+          </w:tcPr>
+          <w:p>
+            <w:r>
               <w:t>Table</w:t>
             </w:r>
           </w:p>
@@ -3179,7 +3158,93 @@
           </w:tcPr>
           <w:p>
             <w:r>
-              <w:t>Each farm's cost project, and an area override where the farm's own area is not the figure to divide by. The farms themselves are Upande Core's records; a row naming a farm Core has not got is ignored.</w:t>
+              <w:t>One row per farm this project works: its cost project — which is where a plan's activities come from — and an area override where the farm's own area is not the figure to divide by. The farms themselves are Upande Core's records. Whether this list also narrows the screens is the checkbox above.</w:t>
+            </w:r>
+          </w:p>
+        </w:tc>
+      </w:tr>
+    </w:tbl>
+    <w:p/>
+    <w:p>
+      <w:r>
+        <w:rPr>
+          <w:color w:val="6F6D65"/>
+          <w:sz w:val="17"/>
+        </w:rPr>
+        <w:t>Who may do what</w:t>
+      </w:r>
+    </w:p>
+    <w:tbl>
+      <w:tblPr>
+        <w:tblStyle w:val="LightGrid-Accent1"/>
+        <w:tblW w:type="auto" w:w="0"/>
+        <w:tblLook w:firstColumn="1" w:firstRow="1" w:lastColumn="0" w:lastRow="0" w:noHBand="0" w:noVBand="1" w:val="04A0"/>
+      </w:tblPr>
+      <w:tblGrid>
+        <w:gridCol w:w="2880"/>
+        <w:gridCol w:w="2880"/>
+        <w:gridCol w:w="2880"/>
+      </w:tblGrid>
+      <w:tr>
+        <w:tc>
+          <w:tcPr>
+            <w:tcW w:type="dxa" w:w="2880"/>
+          </w:tcPr>
+          <w:p>
+            <w:r>
+              <w:t>Setting</w:t>
+            </w:r>
+          </w:p>
+        </w:tc>
+        <w:tc>
+          <w:tcPr>
+            <w:tcW w:type="dxa" w:w="2880"/>
+          </w:tcPr>
+          <w:p>
+            <w:r>
+              <w:t>Type</w:t>
+            </w:r>
+          </w:p>
+        </w:tc>
+        <w:tc>
+          <w:tcPr>
+            <w:tcW w:type="dxa" w:w="2880"/>
+          </w:tcPr>
+          <w:p>
+            <w:r>
+              <w:t>What it does</w:t>
+            </w:r>
+          </w:p>
+        </w:tc>
+      </w:tr>
+      <w:tr>
+        <w:tc>
+          <w:tcPr>
+            <w:tcW w:type="dxa" w:w="2880"/>
+          </w:tcPr>
+          <w:p>
+            <w:r>
+              <w:t>Capabilities</w:t>
+            </w:r>
+          </w:p>
+        </w:tc>
+        <w:tc>
+          <w:tcPr>
+            <w:tcW w:type="dxa" w:w="2880"/>
+          </w:tcPr>
+          <w:p>
+            <w:r>
+              <w:t>Table</w:t>
+            </w:r>
+          </w:p>
+        </w:tc>
+        <w:tc>
+          <w:tcPr>
+            <w:tcW w:type="dxa" w:w="2880"/>
+          </w:tcPr>
+          <w:p>
+            <w:r>
+              <w:t>Who may do each thing the screens allow, beyond approving. Approving is set by the Approval Steps below; this covers the rest -- raising a budget, changing a rate, sending a payment run, entering work.\n\nOne row per capability per role. Add a second row with the same capability to grant it to another role. A capability with no row at all falls back to System Manager, so a site part-way through being configured is never locked out.\n\nThese used to be lists inside the code, naming one company's job titles, so a farm could say who approves a plan and not who may change a rate.</w:t>
             </w:r>
           </w:p>
         </w:tc>
@@ -3833,6 +3898,38 @@
           </w:tcPr>
           <w:p>
             <w:r>
+              <w:t>Show today's presence on the assigner</w:t>
+            </w:r>
+          </w:p>
+        </w:tc>
+        <w:tc>
+          <w:tcPr>
+            <w:tcW w:type="dxa" w:w="2880"/>
+          </w:tcPr>
+          <w:p>
+            <w:r>
+              <w:t>Check</w:t>
+            </w:r>
+          </w:p>
+        </w:tc>
+        <w:tc>
+          <w:tcPr>
+            <w:tcW w:type="dxa" w:w="2880"/>
+          </w:tcPr>
+          <w:p>
+            <w:r>
+              <w:t>On: each worker on the assigner carries a chip for today — P with the scan time when an Employee Checkin or a submitted Attendance says they are on site, A when marked Absent, ? when there is neither. Off by default, because a site without biometric hardware or with attendance kept elsewhere gets ? on every worker, which reads as information and is not. Off, the reads do not run.</w:t>
+            </w:r>
+          </w:p>
+        </w:tc>
+      </w:tr>
+      <w:tr>
+        <w:tc>
+          <w:tcPr>
+            <w:tcW w:type="dxa" w:w="2880"/>
+          </w:tcPr>
+          <w:p>
+            <w:r>
               <w:t>Morning scan cutoff</w:t>
             </w:r>
           </w:p>
@@ -4335,6 +4432,102 @@
           </w:tcPr>
           <w:p>
             <w:r>
+              <w:t>More hours recorded than the day is long</w:t>
+            </w:r>
+          </w:p>
+        </w:tc>
+        <w:tc>
+          <w:tcPr>
+            <w:tcW w:type="dxa" w:w="2880"/>
+          </w:tcPr>
+          <w:p>
+            <w:r>
+              <w:t>Check</w:t>
+            </w:r>
+          </w:p>
+        </w:tc>
+        <w:tc>
+          <w:tcPr>
+            <w:tcW w:type="dxa" w:w="2880"/>
+          </w:tcPr>
+          <w:p>
+            <w:r>
+              <w:t>Flags a worker whose recorded hours across every task on one date exceed that date's standard day. Judged per date, so two ordinary full days are never read as one long one. Sometimes real overtime; often a split day whose halves were both left at the full standard.</w:t>
+            </w:r>
+          </w:p>
+        </w:tc>
+      </w:tr>
+      <w:tr>
+        <w:tc>
+          <w:tcPr>
+            <w:tcW w:type="dxa" w:w="2880"/>
+          </w:tcPr>
+          <w:p>
+            <w:r>
+              <w:t>Hours and output disagree</w:t>
+            </w:r>
+          </w:p>
+        </w:tc>
+        <w:tc>
+          <w:tcPr>
+            <w:tcW w:type="dxa" w:w="2880"/>
+          </w:tcPr>
+          <w:p>
+            <w:r>
+              <w:t>Check</w:t>
+            </w:r>
+          </w:p>
+        </w:tc>
+        <w:tc>
+          <w:tcPr>
+            <w:tcW w:type="dxa" w:w="2880"/>
+          </w:tcPr>
+          <w:p>
+            <w:r>
+              <w:t>Flags a row whose output runs well ahead of the time recorded against it — three hours producing a full day's target. Not a short day: four hours producing about half a target is an ordinary half day and is never flagged.</w:t>
+            </w:r>
+          </w:p>
+        </w:tc>
+      </w:tr>
+      <w:tr>
+        <w:tc>
+          <w:tcPr>
+            <w:tcW w:type="dxa" w:w="2880"/>
+          </w:tcPr>
+          <w:p>
+            <w:r>
+              <w:t>Hourly task where the quantity and the hours differ</w:t>
+            </w:r>
+          </w:p>
+        </w:tc>
+        <w:tc>
+          <w:tcPr>
+            <w:tcW w:type="dxa" w:w="2880"/>
+          </w:tcPr>
+          <w:p>
+            <w:r>
+              <w:t>Check</w:t>
+            </w:r>
+          </w:p>
+        </w:tc>
+        <w:tc>
+          <w:tcPr>
+            <w:tcW w:type="dxa" w:w="2880"/>
+          </w:tcPr>
+          <w:p>
+            <w:r>
+              <w:t>On a task measured in Hours the quantity and the hours are the same fact typed twice. Flags the rows where they disagree — one of the two is wrong, and the quantity is the one that pays.</w:t>
+            </w:r>
+          </w:p>
+        </w:tc>
+      </w:tr>
+      <w:tr>
+        <w:tc>
+          <w:tcPr>
+            <w:tcW w:type="dxa" w:w="2880"/>
+          </w:tcPr>
+          <w:p>
+            <w:r>
               <w:t>Auto-release inactive employees from assignments</w:t>
             </w:r>
           </w:p>
@@ -4421,7 +4614,7 @@
           </w:tcPr>
           <w:p>
             <w:r>
-              <w:t>Require consultant approval for future-week plans</w:t>
+              <w:t>Consultant users (comma-separated emails) (read-only)</w:t>
             </w:r>
           </w:p>
         </w:tc>
@@ -4431,7 +4624,7 @@
           </w:tcPr>
           <w:p>
             <w:r>
-              <w:t>Check</w:t>
+              <w:t>Small Text</w:t>
             </w:r>
           </w:p>
         </w:tc>
@@ -4441,7 +4634,7 @@
           </w:tcPr>
           <w:p>
             <w:r>
-              <w:t>Plans starting in an upcoming week cannot be approved by the Farm Manager until a consultant approves the farm's week on the Weekly review tab (/work-planner). Same-week plans are exempt.</w:t>
+              <w:t>Superseded by Stage Approvers rows on the Planner: Weekly Consultant stage. Read-only, and removed in the next release.</w:t>
             </w:r>
           </w:p>
         </w:tc>
@@ -4453,7 +4646,7 @@
           </w:tcPr>
           <w:p>
             <w:r>
-              <w:t>Consultant users (comma-separated emails) (read-only)</w:t>
+              <w:t>Master plan post-approval editors (comma-separated emails)</w:t>
             </w:r>
           </w:p>
         </w:tc>
@@ -4473,7 +4666,61 @@
           </w:tcPr>
           <w:p>
             <w:r>
-              <w:t>Superseded by Stage Approvers rows on the Planner: Weekly Consultant stage. Read-only, and removed in the next release.</w:t>
+              <w:t>Who may correct a master plan after it is approved. Empty means nobody, which is the default. System Manager is deliberately not swept in — an administrator who must intervene already has the Desk form.</w:t>
+            </w:r>
+          </w:p>
+        </w:tc>
+      </w:tr>
+    </w:tbl>
+    <w:p/>
+    <w:p>
+      <w:r>
+        <w:rPr>
+          <w:color w:val="6F6D65"/>
+          <w:sz w:val="17"/>
+        </w:rPr>
+        <w:t>Master plans</w:t>
+      </w:r>
+    </w:p>
+    <w:tbl>
+      <w:tblPr>
+        <w:tblStyle w:val="LightGrid-Accent1"/>
+        <w:tblW w:type="auto" w:w="0"/>
+        <w:tblLook w:firstColumn="1" w:firstRow="1" w:lastColumn="0" w:lastRow="0" w:noHBand="0" w:noVBand="1" w:val="04A0"/>
+      </w:tblPr>
+      <w:tblGrid>
+        <w:gridCol w:w="2880"/>
+        <w:gridCol w:w="2880"/>
+        <w:gridCol w:w="2880"/>
+      </w:tblGrid>
+      <w:tr>
+        <w:tc>
+          <w:tcPr>
+            <w:tcW w:type="dxa" w:w="2880"/>
+          </w:tcPr>
+          <w:p>
+            <w:r>
+              <w:t>Setting</w:t>
+            </w:r>
+          </w:p>
+        </w:tc>
+        <w:tc>
+          <w:tcPr>
+            <w:tcW w:type="dxa" w:w="2880"/>
+          </w:tcPr>
+          <w:p>
+            <w:r>
+              <w:t>Type</w:t>
+            </w:r>
+          </w:p>
+        </w:tc>
+        <w:tc>
+          <w:tcPr>
+            <w:tcW w:type="dxa" w:w="2880"/>
+          </w:tcPr>
+          <w:p>
+            <w:r>
+              <w:t>What it does</w:t>
             </w:r>
           </w:p>
         </w:tc>
@@ -4485,7 +4732,7 @@
           </w:tcPr>
           <w:p>
             <w:r>
-              <w:t>Master plan post-approval editors (comma-separated emails)</w:t>
+              <w:t>Allow more than one approved master plan per Farm at a time</w:t>
             </w:r>
           </w:p>
         </w:tc>
@@ -4495,7 +4742,7 @@
           </w:tcPr>
           <w:p>
             <w:r>
-              <w:t>Small Text</w:t>
+              <w:t>Check</w:t>
             </w:r>
           </w:p>
         </w:tc>
@@ -4505,7 +4752,201 @@
           </w:tcPr>
           <w:p>
             <w:r>
-              <w:t>Who may correct a master plan after it is approved. Empty means nobody, which is the default. System Manager is deliberately not swept in — an administrator who must intervene already has the Desk form.</w:t>
+              <w:t>Off: a farm holds one approved budget for any given day, and approving a second plan whose period overlaps is refused. On: a farm may run two budgets over the same days — separate streams of work, each with its own ceiling.</w:t>
+              <w:br/>
+              <w:br/>
+              <w:t>Raising an overlapping plan has always been allowed and is reported when it happens; this governs approval. Nothing is bypassed silently: the approver is still told which plan overlaps, because raising the same plan twice by mistake looks identical to raising a deliberate second one.</w:t>
+              <w:br/>
+              <w:br/>
+              <w:t>Each request already records the plan it draws down, so the planner asks which budget when two cover the dates rather than guessing. Off by default — a site that has always run one budget per period keeps doing so.</w:t>
+            </w:r>
+          </w:p>
+        </w:tc>
+      </w:tr>
+    </w:tbl>
+    <w:p/>
+    <w:p>
+      <w:r>
+        <w:rPr>
+          <w:color w:val="6F6D65"/>
+          <w:sz w:val="17"/>
+        </w:rPr>
+        <w:t>A worker's day</w:t>
+      </w:r>
+    </w:p>
+    <w:tbl>
+      <w:tblPr>
+        <w:tblStyle w:val="LightGrid-Accent1"/>
+        <w:tblW w:type="auto" w:w="0"/>
+        <w:tblLook w:firstColumn="1" w:firstRow="1" w:lastColumn="0" w:lastRow="0" w:noHBand="0" w:noVBand="1" w:val="04A0"/>
+      </w:tblPr>
+      <w:tblGrid>
+        <w:gridCol w:w="2880"/>
+        <w:gridCol w:w="2880"/>
+        <w:gridCol w:w="2880"/>
+      </w:tblGrid>
+      <w:tr>
+        <w:tc>
+          <w:tcPr>
+            <w:tcW w:type="dxa" w:w="2880"/>
+          </w:tcPr>
+          <w:p>
+            <w:r>
+              <w:t>Setting</w:t>
+            </w:r>
+          </w:p>
+        </w:tc>
+        <w:tc>
+          <w:tcPr>
+            <w:tcW w:type="dxa" w:w="2880"/>
+          </w:tcPr>
+          <w:p>
+            <w:r>
+              <w:t>Type</w:t>
+            </w:r>
+          </w:p>
+        </w:tc>
+        <w:tc>
+          <w:tcPr>
+            <w:tcW w:type="dxa" w:w="2880"/>
+          </w:tcPr>
+          <w:p>
+            <w:r>
+              <w:t>What it does</w:t>
+            </w:r>
+          </w:p>
+        </w:tc>
+      </w:tr>
+      <w:tr>
+        <w:tc>
+          <w:tcPr>
+            <w:tcW w:type="dxa" w:w="2880"/>
+          </w:tcPr>
+          <w:p>
+            <w:r>
+              <w:t>Allow a worker's day to be split between tasks</w:t>
+            </w:r>
+          </w:p>
+        </w:tc>
+        <w:tc>
+          <w:tcPr>
+            <w:tcW w:type="dxa" w:w="2880"/>
+          </w:tcPr>
+          <w:p>
+            <w:r>
+              <w:t>Check</w:t>
+            </w:r>
+          </w:p>
+        </w:tc>
+        <w:tc>
+          <w:tcPr>
+            <w:tcW w:type="dxa" w:w="2880"/>
+          </w:tcPr>
+          <w:p>
+            <w:r>
+              <w:t>Off: a worker already on a live assignment over these dates cannot be put on another one, which is how it has always worked.</w:t>
+              <w:br/>
+              <w:br/>
+              <w:t>On: they can. Release them from one task's crew — their recorded work and pay stay exactly as they are — and assign them to another, recording work against both on the same day. Hours are then typed on each row, so the day counts once however many tasks it spanned.</w:t>
+              <w:br/>
+              <w:br/>
+              <w:t>Off by default: with it off no figure on any site changes.</w:t>
+            </w:r>
+          </w:p>
+        </w:tc>
+      </w:tr>
+      <w:tr>
+        <w:tc>
+          <w:tcPr>
+            <w:tcW w:type="dxa" w:w="2880"/>
+          </w:tcPr>
+          <w:p>
+            <w:r>
+              <w:t>Standard hours, Monday to Friday</w:t>
+            </w:r>
+          </w:p>
+        </w:tc>
+        <w:tc>
+          <w:tcPr>
+            <w:tcW w:type="dxa" w:w="2880"/>
+          </w:tcPr>
+          <w:p>
+            <w:r>
+              <w:t>Float</w:t>
+            </w:r>
+          </w:p>
+        </w:tc>
+        <w:tc>
+          <w:tcPr>
+            <w:tcW w:type="dxa" w:w="2880"/>
+          </w:tcPr>
+          <w:p>
+            <w:r>
+              <w:t>What a full weekday is. Man-days divide by this, so a worker who gave four of eight hours is half a man-day.</w:t>
+            </w:r>
+          </w:p>
+        </w:tc>
+      </w:tr>
+      <w:tr>
+        <w:tc>
+          <w:tcPr>
+            <w:tcW w:type="dxa" w:w="2880"/>
+          </w:tcPr>
+          <w:p>
+            <w:r>
+              <w:t>Standard hours, Saturday</w:t>
+            </w:r>
+          </w:p>
+        </w:tc>
+        <w:tc>
+          <w:tcPr>
+            <w:tcW w:type="dxa" w:w="2880"/>
+          </w:tcPr>
+          <w:p>
+            <w:r>
+              <w:t>Float</w:t>
+            </w:r>
+          </w:p>
+        </w:tc>
+        <w:tc>
+          <w:tcPr>
+            <w:tcW w:type="dxa" w:w="2880"/>
+          </w:tcPr>
+          <w:p>
+            <w:r>
+              <w:t>Six by default. A full six-hour Saturday is a whole man-day, not three quarters of one.</w:t>
+            </w:r>
+          </w:p>
+        </w:tc>
+      </w:tr>
+      <w:tr>
+        <w:tc>
+          <w:tcPr>
+            <w:tcW w:type="dxa" w:w="2880"/>
+          </w:tcPr>
+          <w:p>
+            <w:r>
+              <w:t>Standard hours, Sunday</w:t>
+            </w:r>
+          </w:p>
+        </w:tc>
+        <w:tc>
+          <w:tcPr>
+            <w:tcW w:type="dxa" w:w="2880"/>
+          </w:tcPr>
+          <w:p>
+            <w:r>
+              <w:t>Float</w:t>
+            </w:r>
+          </w:p>
+        </w:tc>
+        <w:tc>
+          <w:tcPr>
+            <w:tcW w:type="dxa" w:w="2880"/>
+          </w:tcPr>
+          <w:p>
+            <w:r>
+              <w:t>Sunday is worked on these farms, so it is a full day by default. Set it to zero for a site that does not work Sundays — a zero day contributes no man-days rather than dividing by nothing.</w:t>
             </w:r>
           </w:p>
         </w:tc>

</xml_diff>